<commit_message>
added to the introduction of the report
</commit_message>
<xml_diff>
--- a/Final Report.docx
+++ b/Final Report.docx
@@ -48,7 +48,157 @@
     </w:p>
     <w:p>
       <w:r>
-        <w:t xml:space="preserve">Exercise is an imperative part of our lives as humans. NHS general health and fitness guidelines for adults say that you should aim to complete strengthening activities involving all major muscle groups at least 2 days a week and do at least 150 minutes of moderate intensity activity a week. </w:t>
+        <w:t xml:space="preserve">Exergaming, short for exertion gaming, is defined as technology-driven physical activities that require participants to be exerting themselves in one way or another </w:t>
+      </w:r>
+      <w:proofErr w:type="gramStart"/>
+      <w:r>
+        <w:t>in order to</w:t>
+      </w:r>
+      <w:proofErr w:type="gramEnd"/>
+      <w:r>
+        <w:t xml:space="preserve"> play a game. Exergaming was initially conceptualised in the late </w:t>
+      </w:r>
+      <w:r>
+        <w:t>1980s and</w:t>
+      </w:r>
+      <w:r>
+        <w:t xml:space="preserve"> gained significant popularity with the introduction of games like </w:t>
+      </w:r>
+      <w:r>
+        <w:t>“</w:t>
+      </w:r>
+      <w:r>
+        <w:t xml:space="preserve">Dance </w:t>
+      </w:r>
+      <w:proofErr w:type="spellStart"/>
+      <w:r>
+        <w:t>Dance</w:t>
+      </w:r>
+      <w:proofErr w:type="spellEnd"/>
+      <w:r>
+        <w:t xml:space="preserve"> Revolution</w:t>
+      </w:r>
+      <w:r>
+        <w:t>”</w:t>
+      </w:r>
+      <w:r>
+        <w:t xml:space="preserve"> in the late 1990s. The </w:t>
+      </w:r>
+      <w:r>
+        <w:t>introduction</w:t>
+      </w:r>
+      <w:r>
+        <w:t xml:space="preserve"> of the Nintendo Wii and Xbox Kinect in the early 2000s further </w:t>
+      </w:r>
+      <w:r>
+        <w:t>pushed</w:t>
+      </w:r>
+      <w:r>
+        <w:t xml:space="preserve"> exergaming into the mainstream</w:t>
+      </w:r>
+      <w:r>
+        <w:t xml:space="preserve"> media</w:t>
+      </w:r>
+      <w:r>
+        <w:t xml:space="preserve">, with these consoles and their games demonstrating the potential of </w:t>
+      </w:r>
+      <w:r>
+        <w:t>exercise in</w:t>
+      </w:r>
+      <w:r>
+        <w:t xml:space="preserve"> gaming. </w:t>
+      </w:r>
+      <w:r>
+        <w:t xml:space="preserve">The term “exergaming” entered the Collins English Dictionary in 2007, marking a point where the concept was officially recognised and popularised. Exergaming has continued to develop into not only video games, but also gaming technologies integrated with exercise equipment, mobile apps, and virtual reality. </w:t>
+      </w:r>
+    </w:p>
+    <w:p>
+      <w:r>
+        <w:t>Virtual reality has become a compelling platform for exergaming development due to its unparalleled immersion and captivating nature. VR in exergames has shown to increase both enjoyment and motivation of physical exercise over both short</w:t>
+      </w:r>
+      <w:r>
+        <w:t xml:space="preserve"> [Farrow et al, 2019]</w:t>
+      </w:r>
+      <w:r>
+        <w:t>, and long periods of time</w:t>
+      </w:r>
+      <w:r>
+        <w:t xml:space="preserve"> [</w:t>
+      </w:r>
+      <w:r>
+        <w:t xml:space="preserve">Michael &amp; </w:t>
+      </w:r>
+      <w:proofErr w:type="spellStart"/>
+      <w:r>
+        <w:t>Lutteroth</w:t>
+      </w:r>
+      <w:proofErr w:type="spellEnd"/>
+      <w:r>
+        <w:t>, 2020</w:t>
+      </w:r>
+      <w:r>
+        <w:t>]</w:t>
+      </w:r>
+      <w:r>
+        <w:t>.</w:t>
+      </w:r>
+      <w:r>
+        <w:t xml:space="preserve"> Virtual reality allows for a wider range of virtual activities compared to flatscreen exergaming, including sports, dance, and adventure games. Additionally, VR environments </w:t>
+      </w:r>
+      <w:r>
+        <w:t>are promising treatment to</w:t>
+      </w:r>
+      <w:r>
+        <w:t xml:space="preserve"> mitigate functional decline and promote cognitive rehabilitation</w:t>
+      </w:r>
+      <w:r>
+        <w:t xml:space="preserve"> [Marotta et al, 2022].</w:t>
+      </w:r>
+      <w:r>
+        <w:t xml:space="preserve"> Some studies suggest that VR exergames can have a positive impact on cognitive function, memory, and depression, particularly in older adults {FIND REFERENCE}.</w:t>
+      </w:r>
+    </w:p>
+    <w:p>
+      <w:r>
+        <w:t xml:space="preserve">In 2022 31% of adults worldwide (1.8 billion people), did not meet the recommended levels of physical activity </w:t>
+      </w:r>
+      <w:hyperlink r:id="rId5" w:anchor=":~:text=Physical%20inactivity%20puts%20adults%20at,The%20Lancet%20Global%20Health%20journal." w:history="1">
+        <w:r>
+          <w:rPr>
+            <w:rStyle w:val="Hyperlink"/>
+          </w:rPr>
+          <w:t>[</w:t>
+        </w:r>
+        <w:r>
+          <w:rPr>
+            <w:rStyle w:val="Hyperlink"/>
+          </w:rPr>
+          <w:t>]</w:t>
+        </w:r>
+      </w:hyperlink>
+      <w:r>
+        <w:t>. Physical inactivity puts adults at greater risk of cardiovascular diseases such as heart attacks and strokes, type 2 diabetes, dementia and cancers such as breast and colon. VR exergames provide a unique opportunity to revolutionise traditional exercise routines in ways reality simply cannot</w:t>
+      </w:r>
+      <w:r>
+        <w:t xml:space="preserve"> to aim to tackle the global issue of sedentary lifestyles</w:t>
+      </w:r>
+      <w:r>
+        <w:t xml:space="preserve">. By merging immersive </w:t>
+      </w:r>
+      <w:r>
+        <w:t xml:space="preserve">and motivating </w:t>
+      </w:r>
+      <w:r>
+        <w:t xml:space="preserve">gaming experiences with pre-existing workouts, we can both increase enjoyment and motivation of exercise, as well as the convenience </w:t>
+      </w:r>
+      <w:r>
+        <w:t xml:space="preserve">and accessibility </w:t>
+      </w:r>
+      <w:r>
+        <w:t>of indulging in it</w:t>
+      </w:r>
+      <w:r>
+        <w:t xml:space="preserve">. </w:t>
       </w:r>
     </w:p>
     <w:p>
@@ -67,6 +217,23 @@
       </w:r>
     </w:p>
     <w:p>
+      <w:r>
+        <w:lastRenderedPageBreak/>
+        <w:t>Despite the growing popularity of VR exergaming as a tool to promote physical exercise, many VR fitness applications lack dynamic social interaction implementations that effectively sustain user motivation and engagement, while research has shown that incorporating competition and cooperation in exergames can both enhance user performance and effort</w:t>
+      </w:r>
+      <w:r>
+        <w:t xml:space="preserve"> [FIND REFERENCE]</w:t>
+      </w:r>
+      <w:r>
+        <w:t>, we have a limited understanding of how these social dynamics specifically impact user experience within VR cycling. Furthermore, more existing VR exergames are not tailored towards the user’s specific fitness level, resulting in an experience that may be either too difficult or too easy, reducing long-term engagement.</w:t>
+      </w:r>
+    </w:p>
+    <w:p>
+      <w:r>
+        <w:t>Therefore, there is a critical need for further exploration on how competitive and cooperative elements in VR cycling applications influence the user’s performance, motivation, and engagement across a diverse range of users. Additionally, the integration of adaptive AI opponents and teammates that respond to the user’s effort could provide a scalable solution for tailoring difficulty and social interaction, making VR exergaming more accessible and enjoyable. Addressing these gaps is essential for developing VR fitness solutions that are immersive, personalised, and sustainable in promoting physical exercise.</w:t>
+      </w:r>
+    </w:p>
+    <w:p>
       <w:pPr>
         <w:pStyle w:val="ListParagraph"/>
         <w:numPr>
@@ -82,6 +249,44 @@
       </w:r>
     </w:p>
     <w:p>
+      <w:r>
+        <w:t>The aim of this project is to develop a VR cycling game with varied social interaction designs to investigate how cooperative and competitive gameplay mechanics influence user performance, engagement, and fitness outcomes. The project seeks to address the lack of accessible and engaging VR cycling platforms that cater to users with different motivational triggers and fitness levels. By integrating adaptive AI-driven scenarios and real-time feedback, the project aims to create an exergaming experience that is both engaging and inclusive for a wide range of users.</w:t>
+      </w:r>
+    </w:p>
+    <w:p>
+      <w:r>
+        <w:t xml:space="preserve">This project aims to develop three distinct cycling scenarios. These scenarios will take place in a prototype velodrome with minimal visual clutter to distract from the </w:t>
+      </w:r>
+      <w:r>
+        <w:t xml:space="preserve">workout with the user completing the same physical workout routine through each scenario. </w:t>
+      </w:r>
+      <w:r>
+        <w:t xml:space="preserve">(1) A baseline scenario </w:t>
+      </w:r>
+      <w:r>
+        <w:t>involving the user pedalling around the velodrome on a solo bike ride, (2) a cooperative scenario involving the user pedalling around in a paceline with three AI teammates, (3) a competitive scenario involving the user pedalling around in a race competing against AI’s with performance based on the users previous two scenario performances, with relative difficulty variating based on the users current heart rate.</w:t>
+      </w:r>
+    </w:p>
+    <w:p>
+      <w:r>
+        <w:t xml:space="preserve">This project aims to incorporate social interaction and gamification elements into VR exergaming through implementing features such as: real-time performance tracking for the user to view if desired as well as leaderboard performances based on previous bests, AI teammates and opponents capable of dynamic behaviour adjustments based </w:t>
+      </w:r>
+      <w:r>
+        <w:lastRenderedPageBreak/>
+        <w:t>on user effort and exertion to maintain challenge and engagement, post-race analytics to provide users with detailed performance feedback across all scenarios.</w:t>
+      </w:r>
+    </w:p>
+    <w:p>
+      <w:r>
+        <w:t>This project aims to evaluate user performance and engagement through a mixed-method user study to assess performance metrics such as speed, cadence, power output, heart rate, and time-to-completion across the different scenarios. Additionally, this project aims to gather qualitative feedback through surveys and questionnaires to evaluate user engagement, motivation, and experience in each scenario, as well as investigate possible correlations between user personality traits and preferences for competitive or cooperative gameplay modes.</w:t>
+      </w:r>
+    </w:p>
+    <w:p>
+      <w:r>
+        <w:t>This project aims to ensure accessibility and usability of the system, with user interfaces designed in an intuitive manner to optimise ease of use. The implementation of adaptive AI difficulty scaling, to tailor challenge levels to users of varying levels of fitness, as well as follow UI/UX best practices to ensure users can navigate the system effectively without unnecessary complexity or barriers.</w:t>
+      </w:r>
+    </w:p>
+    <w:p>
       <w:pPr>
         <w:pStyle w:val="ListParagraph"/>
         <w:numPr>
@@ -94,6 +299,56 @@
       </w:r>
     </w:p>
     <w:p>
+      <w:r>
+        <w:t>General fitness enthusiasts and individuals seeking motivational exercise tools. For people looking for more engaging ways to exercise, especially those who struggle with traditional fitness routines due to lack of motivation or boredom, VR exergaming can be a great solution through its gamification of real-world exercises. Individuals of varying fitness levels, from beginners to advanced athletes, who can benefit from adaptive AI that tailor’s difficulty to their abilities.</w:t>
+      </w:r>
+    </w:p>
+    <w:p>
+      <w:r>
+        <w:t>Individuals interested in home-based or VR-based fitness solutions. Home exercisers, especially those with limited access to gyms or outdoor activities, who are seeking immersive and interactive fitness experiences. People motivated by interactive environments and social gaming elements to maintain regular exercise habits.</w:t>
+      </w:r>
+    </w:p>
+    <w:p>
+      <w:r>
+        <w:t>Health and rehabilitation professionals. Physical therapists and rehabilitation specialists looking for innovative ways to encourage cardiovascular exercise and rehabilitation training through VR. Could be adapted for patients needing low impact yet engaging cardio sessions in controlled environments.</w:t>
+      </w:r>
+    </w:p>
+    <w:p>
+      <w:r>
+        <w:t xml:space="preserve">Researchers and developers in VR, exergaming, and health technology. Academic researchers exploring the </w:t>
+      </w:r>
+      <w:proofErr w:type="spellStart"/>
+      <w:r>
+        <w:t>pysychological</w:t>
+      </w:r>
+      <w:proofErr w:type="spellEnd"/>
+      <w:r>
+        <w:t xml:space="preserve"> and physiological impacts of social dynamics in exergames, such as cooperation and competition. Game </w:t>
+      </w:r>
+      <w:proofErr w:type="spellStart"/>
+      <w:r>
+        <w:t>devleopers</w:t>
+      </w:r>
+      <w:proofErr w:type="spellEnd"/>
+      <w:r>
+        <w:t xml:space="preserve"> and VR designers focusing on serious games for health, who can use insights from this project to create more adaptive and motivational exergaming experiences.</w:t>
+      </w:r>
+    </w:p>
+    <w:p>
+      <w:r>
+        <w:t xml:space="preserve">Organisations focused on public health and fitness promotion. Public health bodies, fitness organisations, and wellness programs aiming to promote active lifestyles using innovative technologies like VR. These organisations could leverage motivational </w:t>
+      </w:r>
+      <w:r>
+        <w:lastRenderedPageBreak/>
+        <w:t>insights from this project to design campaigns or interventions encouraging physical activity through gamified VR experiences.</w:t>
+      </w:r>
+    </w:p>
+    <w:p>
+      <w:r>
+        <w:t>The VR and gaming industry. VR developers seeking to expand into the fitness and wellness market with products that combine entertainment with physical benefits. Companies working on hardware that could integrate social and adaptive features into their platforms.</w:t>
+      </w:r>
+    </w:p>
+    <w:p>
       <w:pPr>
         <w:pStyle w:val="ListParagraph"/>
         <w:numPr>
@@ -327,493 +582,626 @@
         </w:numPr>
       </w:pPr>
       <w:r>
+        <w:t xml:space="preserve">UI/UX considerations and gamification elements (progress bars, </w:t>
+      </w:r>
+      <w:proofErr w:type="spellStart"/>
+      <w:r>
+        <w:t>post race</w:t>
+      </w:r>
+      <w:proofErr w:type="spellEnd"/>
+      <w:r>
+        <w:t xml:space="preserve"> analytics).</w:t>
+      </w:r>
+    </w:p>
+    <w:p>
+      <w:pPr>
+        <w:pStyle w:val="ListParagraph"/>
+        <w:numPr>
+          <w:ilvl w:val="2"/>
+          <w:numId w:val="2"/>
+        </w:numPr>
+      </w:pPr>
+      <w:r>
+        <w:t>Data logging and analytics pipeline.</w:t>
+      </w:r>
+    </w:p>
+    <w:p>
+      <w:pPr>
+        <w:pStyle w:val="ListParagraph"/>
+        <w:numPr>
+          <w:ilvl w:val="2"/>
+          <w:numId w:val="2"/>
+        </w:numPr>
+      </w:pPr>
+      <w:r>
+        <w:t>Tools/libraries for data collection and visualisation (Python, Unity plugins)</w:t>
+      </w:r>
+    </w:p>
+    <w:p>
+      <w:pPr>
+        <w:pStyle w:val="ListParagraph"/>
+        <w:numPr>
+          <w:ilvl w:val="1"/>
+          <w:numId w:val="2"/>
+        </w:numPr>
+      </w:pPr>
+      <w:r>
+        <w:t>Methodology for User Study</w:t>
+      </w:r>
+    </w:p>
+    <w:p>
+      <w:pPr>
+        <w:pStyle w:val="ListParagraph"/>
+        <w:numPr>
+          <w:ilvl w:val="2"/>
+          <w:numId w:val="2"/>
+        </w:numPr>
+      </w:pPr>
+      <w:r>
+        <w:t>Participant recruitment, consent, and ethics</w:t>
+      </w:r>
+    </w:p>
+    <w:p>
+      <w:pPr>
+        <w:pStyle w:val="ListParagraph"/>
+        <w:numPr>
+          <w:ilvl w:val="2"/>
+          <w:numId w:val="2"/>
+        </w:numPr>
+      </w:pPr>
+      <w:r>
+        <w:t xml:space="preserve">Study design (within-subject, counterbalanced if needed). </w:t>
+      </w:r>
+    </w:p>
+    <w:p>
+      <w:pPr>
+        <w:pStyle w:val="ListParagraph"/>
+        <w:numPr>
+          <w:ilvl w:val="2"/>
+          <w:numId w:val="2"/>
+        </w:numPr>
+      </w:pPr>
+      <w:r>
+        <w:t xml:space="preserve">Metrics: </w:t>
+      </w:r>
+    </w:p>
+    <w:p>
+      <w:pPr>
+        <w:pStyle w:val="ListParagraph"/>
+        <w:numPr>
+          <w:ilvl w:val="3"/>
+          <w:numId w:val="2"/>
+        </w:numPr>
+      </w:pPr>
+      <w:r>
+        <w:t xml:space="preserve">Quantitative (speed, cadence, power, HR, time). </w:t>
+      </w:r>
+    </w:p>
+    <w:p>
+      <w:pPr>
+        <w:pStyle w:val="ListParagraph"/>
+        <w:numPr>
+          <w:ilvl w:val="3"/>
+          <w:numId w:val="2"/>
+        </w:numPr>
+      </w:pPr>
+      <w:r>
         <w:lastRenderedPageBreak/>
-        <w:t xml:space="preserve">UI/UX considerations and gamification elements (progress bars, </w:t>
-      </w:r>
+        <w:t>Qualitative (user experience, engagement, enjoyment (via surveys)</w:t>
+      </w:r>
+    </w:p>
+    <w:p>
+      <w:pPr>
+        <w:pStyle w:val="ListParagraph"/>
+        <w:numPr>
+          <w:ilvl w:val="3"/>
+          <w:numId w:val="2"/>
+        </w:numPr>
+      </w:pPr>
+      <w:r>
+        <w:t>Personality data for exploring correlations.</w:t>
+      </w:r>
+    </w:p>
+    <w:p>
+      <w:pPr>
+        <w:pStyle w:val="ListParagraph"/>
+        <w:numPr>
+          <w:ilvl w:val="2"/>
+          <w:numId w:val="2"/>
+        </w:numPr>
+      </w:pPr>
+      <w:r>
+        <w:t>Risk analysis and mitigation strategies (as in initial plan)</w:t>
+      </w:r>
+    </w:p>
+    <w:p>
+      <w:pPr>
+        <w:pStyle w:val="ListParagraph"/>
+        <w:numPr>
+          <w:ilvl w:val="2"/>
+          <w:numId w:val="2"/>
+        </w:numPr>
+      </w:pPr>
+      <w:r>
+        <w:t>Timeline for development testing and study</w:t>
+      </w:r>
+    </w:p>
+    <w:p>
+      <w:pPr>
+        <w:pStyle w:val="ListParagraph"/>
+        <w:numPr>
+          <w:ilvl w:val="0"/>
+          <w:numId w:val="2"/>
+        </w:numPr>
+      </w:pPr>
+      <w:r>
+        <w:t>Results and Evaluation</w:t>
+      </w:r>
+    </w:p>
+    <w:p>
+      <w:pPr>
+        <w:pStyle w:val="ListParagraph"/>
+        <w:numPr>
+          <w:ilvl w:val="1"/>
+          <w:numId w:val="2"/>
+        </w:numPr>
+      </w:pPr>
+      <w:r>
+        <w:t>Quantitative results</w:t>
+      </w:r>
+    </w:p>
+    <w:p>
+      <w:pPr>
+        <w:pStyle w:val="ListParagraph"/>
+        <w:numPr>
+          <w:ilvl w:val="2"/>
+          <w:numId w:val="2"/>
+        </w:numPr>
+      </w:pPr>
+      <w:r>
+        <w:t>Comparative analysis of performance metrics across the three scenarios</w:t>
+      </w:r>
+    </w:p>
+    <w:p>
+      <w:pPr>
+        <w:pStyle w:val="ListParagraph"/>
+        <w:numPr>
+          <w:ilvl w:val="2"/>
+          <w:numId w:val="2"/>
+        </w:numPr>
+      </w:pPr>
+      <w:r>
+        <w:t>Visualisations (graphs of time, power output, HR, etc)</w:t>
+      </w:r>
+    </w:p>
+    <w:p>
+      <w:pPr>
+        <w:pStyle w:val="ListParagraph"/>
+        <w:numPr>
+          <w:ilvl w:val="2"/>
+          <w:numId w:val="2"/>
+        </w:numPr>
+      </w:pPr>
+      <w:r>
+        <w:t>Statistical Analysis (ANOVA, t-tests for paired comparisons)</w:t>
+      </w:r>
+    </w:p>
+    <w:p>
+      <w:pPr>
+        <w:pStyle w:val="ListParagraph"/>
+        <w:numPr>
+          <w:ilvl w:val="2"/>
+          <w:numId w:val="2"/>
+        </w:numPr>
+      </w:pPr>
+      <w:r>
+        <w:t>Interpretation of results regarding performance under cooperative/competitive dynamics.</w:t>
+      </w:r>
+    </w:p>
+    <w:p>
+      <w:pPr>
+        <w:pStyle w:val="ListParagraph"/>
+        <w:numPr>
+          <w:ilvl w:val="1"/>
+          <w:numId w:val="2"/>
+        </w:numPr>
+      </w:pPr>
+      <w:r>
+        <w:t>Qualitative Results</w:t>
+      </w:r>
+    </w:p>
+    <w:p>
+      <w:pPr>
+        <w:pStyle w:val="ListParagraph"/>
+        <w:numPr>
+          <w:ilvl w:val="2"/>
+          <w:numId w:val="2"/>
+        </w:numPr>
+      </w:pPr>
+      <w:r>
+        <w:t>Thematic analysis of user feedback (motivation, engagement, enjoyment)</w:t>
+      </w:r>
+    </w:p>
+    <w:p>
+      <w:pPr>
+        <w:pStyle w:val="ListParagraph"/>
+        <w:numPr>
+          <w:ilvl w:val="2"/>
+          <w:numId w:val="2"/>
+        </w:numPr>
+      </w:pPr>
+      <w:r>
+        <w:t>Reflections on user preferences between cooperation and competition.</w:t>
+      </w:r>
+    </w:p>
+    <w:p>
+      <w:pPr>
+        <w:pStyle w:val="ListParagraph"/>
+        <w:numPr>
+          <w:ilvl w:val="2"/>
+          <w:numId w:val="2"/>
+        </w:numPr>
+      </w:pPr>
+      <w:r>
+        <w:t>Summary of personal correlations, if found.</w:t>
+      </w:r>
+    </w:p>
+    <w:p>
+      <w:pPr>
+        <w:pStyle w:val="ListParagraph"/>
+        <w:numPr>
+          <w:ilvl w:val="1"/>
+          <w:numId w:val="2"/>
+        </w:numPr>
+      </w:pPr>
+      <w:r>
+        <w:t>Evaluation and critical reflection</w:t>
+      </w:r>
+    </w:p>
+    <w:p>
+      <w:pPr>
+        <w:pStyle w:val="ListParagraph"/>
+        <w:numPr>
+          <w:ilvl w:val="2"/>
+          <w:numId w:val="2"/>
+        </w:numPr>
+      </w:pPr>
+      <w:r>
+        <w:t>Effectiveness of gamification and AI in enhancing engagement.</w:t>
+      </w:r>
+    </w:p>
+    <w:p>
+      <w:pPr>
+        <w:pStyle w:val="ListParagraph"/>
+        <w:numPr>
+          <w:ilvl w:val="2"/>
+          <w:numId w:val="2"/>
+        </w:numPr>
+      </w:pPr>
+      <w:r>
+        <w:t>Success and limitations of AI difficulty adjustment</w:t>
+      </w:r>
+    </w:p>
+    <w:p>
+      <w:pPr>
+        <w:pStyle w:val="ListParagraph"/>
+        <w:numPr>
+          <w:ilvl w:val="2"/>
+          <w:numId w:val="2"/>
+        </w:numPr>
+      </w:pPr>
+      <w:r>
+        <w:t>Discussion of accessibility and usability feedback from participants.</w:t>
+      </w:r>
+    </w:p>
+    <w:p>
+      <w:pPr>
+        <w:pStyle w:val="ListParagraph"/>
+        <w:numPr>
+          <w:ilvl w:val="2"/>
+          <w:numId w:val="2"/>
+        </w:numPr>
+      </w:pPr>
+      <w:r>
+        <w:t xml:space="preserve">Issues encountered (bugs, AI behaviour, data collection reliability). </w:t>
+      </w:r>
+    </w:p>
+    <w:p>
+      <w:pPr>
+        <w:pStyle w:val="ListParagraph"/>
+        <w:numPr>
+          <w:ilvl w:val="2"/>
+          <w:numId w:val="2"/>
+        </w:numPr>
+      </w:pPr>
+      <w:r>
+        <w:t>Validation of the game as a fitness tool.</w:t>
+      </w:r>
+    </w:p>
+    <w:p>
+      <w:pPr>
+        <w:pStyle w:val="ListParagraph"/>
+        <w:numPr>
+          <w:ilvl w:val="0"/>
+          <w:numId w:val="2"/>
+        </w:numPr>
+      </w:pPr>
+      <w:r>
+        <w:t>Conclusions and Future Work</w:t>
+      </w:r>
+    </w:p>
+    <w:p>
+      <w:pPr>
+        <w:pStyle w:val="ListParagraph"/>
+        <w:numPr>
+          <w:ilvl w:val="1"/>
+          <w:numId w:val="2"/>
+        </w:numPr>
+      </w:pPr>
+      <w:r>
+        <w:t>Summary of Key Findings</w:t>
+      </w:r>
+    </w:p>
+    <w:p>
+      <w:pPr>
+        <w:pStyle w:val="ListParagraph"/>
+        <w:numPr>
+          <w:ilvl w:val="2"/>
+          <w:numId w:val="2"/>
+        </w:numPr>
+      </w:pPr>
+      <w:r>
+        <w:t>Impact of competition and cooperation on user performance and engagement.</w:t>
+      </w:r>
+    </w:p>
+    <w:p>
+      <w:pPr>
+        <w:pStyle w:val="ListParagraph"/>
+        <w:numPr>
+          <w:ilvl w:val="2"/>
+          <w:numId w:val="2"/>
+        </w:numPr>
+      </w:pPr>
+      <w:r>
+        <w:t>Strengths and weaknesses of the developed system.</w:t>
+      </w:r>
+    </w:p>
+    <w:p>
+      <w:pPr>
+        <w:pStyle w:val="ListParagraph"/>
+        <w:numPr>
+          <w:ilvl w:val="1"/>
+          <w:numId w:val="2"/>
+        </w:numPr>
+      </w:pPr>
+      <w:r>
+        <w:t>Contributions to the field</w:t>
+      </w:r>
+    </w:p>
+    <w:p>
+      <w:pPr>
+        <w:pStyle w:val="ListParagraph"/>
+        <w:numPr>
+          <w:ilvl w:val="2"/>
+          <w:numId w:val="2"/>
+        </w:numPr>
+      </w:pPr>
+      <w:r>
+        <w:t>Novelty of integrating social mechanics dynamically in VR exergames.</w:t>
+      </w:r>
+    </w:p>
+    <w:p>
+      <w:pPr>
+        <w:pStyle w:val="ListParagraph"/>
+        <w:numPr>
+          <w:ilvl w:val="2"/>
+          <w:numId w:val="2"/>
+        </w:numPr>
+      </w:pPr>
+      <w:r>
+        <w:t>Insights into VR exergaming for different personality and fitness types.</w:t>
+      </w:r>
+    </w:p>
+    <w:p>
+      <w:pPr>
+        <w:pStyle w:val="ListParagraph"/>
+        <w:numPr>
+          <w:ilvl w:val="1"/>
+          <w:numId w:val="2"/>
+        </w:numPr>
+      </w:pPr>
+      <w:r>
+        <w:t>Future Work</w:t>
+      </w:r>
+    </w:p>
+    <w:p>
+      <w:pPr>
+        <w:pStyle w:val="ListParagraph"/>
+        <w:numPr>
+          <w:ilvl w:val="2"/>
+          <w:numId w:val="2"/>
+        </w:numPr>
+      </w:pPr>
       <w:proofErr w:type="spellStart"/>
       <w:r>
-        <w:t>post race</w:t>
+        <w:t>Improvign</w:t>
       </w:r>
       <w:proofErr w:type="spellEnd"/>
       <w:r>
-        <w:t xml:space="preserve"> analytics).</w:t>
-      </w:r>
-    </w:p>
-    <w:p>
-      <w:pPr>
-        <w:pStyle w:val="ListParagraph"/>
-        <w:numPr>
-          <w:ilvl w:val="2"/>
-          <w:numId w:val="2"/>
-        </w:numPr>
-      </w:pPr>
-      <w:r>
-        <w:t>Data logging and analytics pipeline.</w:t>
-      </w:r>
-    </w:p>
-    <w:p>
-      <w:pPr>
-        <w:pStyle w:val="ListParagraph"/>
-        <w:numPr>
-          <w:ilvl w:val="2"/>
-          <w:numId w:val="2"/>
-        </w:numPr>
-      </w:pPr>
-      <w:r>
-        <w:t>Tools/libraries for data collection and visualisation (Python, Unity plugins)</w:t>
-      </w:r>
-    </w:p>
-    <w:p>
-      <w:pPr>
-        <w:pStyle w:val="ListParagraph"/>
-        <w:numPr>
-          <w:ilvl w:val="1"/>
-          <w:numId w:val="2"/>
-        </w:numPr>
-      </w:pPr>
-      <w:r>
-        <w:t>Methodology for User Study</w:t>
-      </w:r>
-    </w:p>
-    <w:p>
-      <w:pPr>
-        <w:pStyle w:val="ListParagraph"/>
-        <w:numPr>
-          <w:ilvl w:val="2"/>
-          <w:numId w:val="2"/>
-        </w:numPr>
-      </w:pPr>
-      <w:r>
-        <w:t>Participant recruitment, consent, and ethics</w:t>
-      </w:r>
-    </w:p>
-    <w:p>
-      <w:pPr>
-        <w:pStyle w:val="ListParagraph"/>
-        <w:numPr>
-          <w:ilvl w:val="2"/>
-          <w:numId w:val="2"/>
-        </w:numPr>
-      </w:pPr>
-      <w:r>
-        <w:t xml:space="preserve">Study design (within-subject, counterbalanced if needed). </w:t>
-      </w:r>
-    </w:p>
-    <w:p>
-      <w:pPr>
-        <w:pStyle w:val="ListParagraph"/>
-        <w:numPr>
-          <w:ilvl w:val="2"/>
-          <w:numId w:val="2"/>
-        </w:numPr>
-      </w:pPr>
-      <w:r>
-        <w:t xml:space="preserve">Metrics: </w:t>
-      </w:r>
-    </w:p>
-    <w:p>
-      <w:pPr>
-        <w:pStyle w:val="ListParagraph"/>
-        <w:numPr>
-          <w:ilvl w:val="3"/>
-          <w:numId w:val="2"/>
-        </w:numPr>
-      </w:pPr>
-      <w:r>
-        <w:t xml:space="preserve">Quantitative (speed, cadence, power, HR, time). </w:t>
-      </w:r>
-    </w:p>
-    <w:p>
-      <w:pPr>
-        <w:pStyle w:val="ListParagraph"/>
-        <w:numPr>
-          <w:ilvl w:val="3"/>
-          <w:numId w:val="2"/>
-        </w:numPr>
-      </w:pPr>
-      <w:r>
-        <w:t>Qualitative (user experience, engagement, enjoyment (via surveys)</w:t>
-      </w:r>
-    </w:p>
-    <w:p>
-      <w:pPr>
-        <w:pStyle w:val="ListParagraph"/>
-        <w:numPr>
-          <w:ilvl w:val="3"/>
-          <w:numId w:val="2"/>
-        </w:numPr>
-      </w:pPr>
-      <w:r>
-        <w:t>Personality data for exploring correlations.</w:t>
-      </w:r>
-    </w:p>
-    <w:p>
-      <w:pPr>
-        <w:pStyle w:val="ListParagraph"/>
-        <w:numPr>
-          <w:ilvl w:val="2"/>
-          <w:numId w:val="2"/>
-        </w:numPr>
-      </w:pPr>
-      <w:r>
-        <w:t>Risk analysis and mitigation strategies (as in initial plan)</w:t>
-      </w:r>
-    </w:p>
-    <w:p>
-      <w:pPr>
-        <w:pStyle w:val="ListParagraph"/>
-        <w:numPr>
-          <w:ilvl w:val="2"/>
-          <w:numId w:val="2"/>
-        </w:numPr>
-      </w:pPr>
-      <w:r>
-        <w:t>Timeline for development testing and study</w:t>
-      </w:r>
-    </w:p>
-    <w:p>
-      <w:pPr>
-        <w:pStyle w:val="ListParagraph"/>
-        <w:numPr>
-          <w:ilvl w:val="0"/>
-          <w:numId w:val="2"/>
-        </w:numPr>
-      </w:pPr>
-      <w:r>
-        <w:t>Results and Evaluation</w:t>
-      </w:r>
-    </w:p>
-    <w:p>
-      <w:pPr>
-        <w:pStyle w:val="ListParagraph"/>
-        <w:numPr>
-          <w:ilvl w:val="1"/>
-          <w:numId w:val="2"/>
-        </w:numPr>
-      </w:pPr>
-      <w:r>
-        <w:t>Quantitative results</w:t>
-      </w:r>
-    </w:p>
-    <w:p>
-      <w:pPr>
-        <w:pStyle w:val="ListParagraph"/>
-        <w:numPr>
-          <w:ilvl w:val="2"/>
-          <w:numId w:val="2"/>
-        </w:numPr>
-      </w:pPr>
-      <w:r>
-        <w:t>Comparative analysis of performance metrics across the three scenarios</w:t>
-      </w:r>
-    </w:p>
-    <w:p>
-      <w:pPr>
-        <w:pStyle w:val="ListParagraph"/>
-        <w:numPr>
-          <w:ilvl w:val="2"/>
-          <w:numId w:val="2"/>
-        </w:numPr>
-      </w:pPr>
-      <w:r>
-        <w:t>Visualisations (graphs of time, power output, HR, etc)</w:t>
-      </w:r>
-    </w:p>
-    <w:p>
-      <w:pPr>
-        <w:pStyle w:val="ListParagraph"/>
-        <w:numPr>
-          <w:ilvl w:val="2"/>
-          <w:numId w:val="2"/>
-        </w:numPr>
-      </w:pPr>
-      <w:r>
-        <w:t>Statistical Analysis (ANOVA, t-tests for paired comparisons)</w:t>
-      </w:r>
-    </w:p>
-    <w:p>
-      <w:pPr>
-        <w:pStyle w:val="ListParagraph"/>
-        <w:numPr>
-          <w:ilvl w:val="2"/>
-          <w:numId w:val="2"/>
-        </w:numPr>
-      </w:pPr>
-      <w:r>
-        <w:t>Interpretation of results regarding performance under cooperative/competitive dynamics.</w:t>
-      </w:r>
-    </w:p>
-    <w:p>
-      <w:pPr>
-        <w:pStyle w:val="ListParagraph"/>
-        <w:numPr>
-          <w:ilvl w:val="1"/>
-          <w:numId w:val="2"/>
-        </w:numPr>
-      </w:pPr>
-      <w:r>
-        <w:t>Qualitative Results</w:t>
-      </w:r>
-    </w:p>
-    <w:p>
-      <w:pPr>
-        <w:pStyle w:val="ListParagraph"/>
-        <w:numPr>
-          <w:ilvl w:val="2"/>
-          <w:numId w:val="2"/>
-        </w:numPr>
-      </w:pPr>
-      <w:r>
-        <w:t>Thematic analysis of user feedback (motivation, engagement, enjoyment)</w:t>
-      </w:r>
-    </w:p>
-    <w:p>
-      <w:pPr>
-        <w:pStyle w:val="ListParagraph"/>
-        <w:numPr>
-          <w:ilvl w:val="2"/>
-          <w:numId w:val="2"/>
-        </w:numPr>
-      </w:pPr>
-      <w:r>
-        <w:t>Reflections on user preferences between cooperation and competition.</w:t>
-      </w:r>
-    </w:p>
-    <w:p>
-      <w:pPr>
-        <w:pStyle w:val="ListParagraph"/>
-        <w:numPr>
-          <w:ilvl w:val="2"/>
-          <w:numId w:val="2"/>
-        </w:numPr>
-      </w:pPr>
-      <w:r>
-        <w:t>Summary of personal correlations, if found.</w:t>
-      </w:r>
-    </w:p>
-    <w:p>
-      <w:pPr>
-        <w:pStyle w:val="ListParagraph"/>
-        <w:numPr>
-          <w:ilvl w:val="1"/>
-          <w:numId w:val="2"/>
-        </w:numPr>
-      </w:pPr>
-      <w:r>
-        <w:t>Evaluation and critical reflection</w:t>
-      </w:r>
-    </w:p>
-    <w:p>
-      <w:pPr>
-        <w:pStyle w:val="ListParagraph"/>
-        <w:numPr>
-          <w:ilvl w:val="2"/>
-          <w:numId w:val="2"/>
-        </w:numPr>
-      </w:pPr>
-      <w:r>
-        <w:t>Effectiveness of gamification and AI in enhancing engagement.</w:t>
-      </w:r>
-    </w:p>
-    <w:p>
-      <w:pPr>
-        <w:pStyle w:val="ListParagraph"/>
-        <w:numPr>
-          <w:ilvl w:val="2"/>
-          <w:numId w:val="2"/>
-        </w:numPr>
-      </w:pPr>
-      <w:r>
-        <w:t>Success and limitations of AI difficulty adjustment</w:t>
-      </w:r>
-    </w:p>
-    <w:p>
-      <w:pPr>
-        <w:pStyle w:val="ListParagraph"/>
-        <w:numPr>
-          <w:ilvl w:val="2"/>
-          <w:numId w:val="2"/>
-        </w:numPr>
-      </w:pPr>
-      <w:r>
-        <w:t>Discussion of accessibility and usability feedback from participants.</w:t>
-      </w:r>
-    </w:p>
-    <w:p>
-      <w:pPr>
-        <w:pStyle w:val="ListParagraph"/>
-        <w:numPr>
-          <w:ilvl w:val="2"/>
-          <w:numId w:val="2"/>
-        </w:numPr>
-      </w:pPr>
-      <w:r>
-        <w:t xml:space="preserve">Issues encountered (bugs, AI behaviour, data collection reliability). </w:t>
-      </w:r>
-    </w:p>
-    <w:p>
-      <w:pPr>
-        <w:pStyle w:val="ListParagraph"/>
-        <w:numPr>
-          <w:ilvl w:val="2"/>
-          <w:numId w:val="2"/>
-        </w:numPr>
-      </w:pPr>
-      <w:r>
-        <w:t>Validation of the game as a fitness tool.</w:t>
-      </w:r>
-    </w:p>
-    <w:p>
-      <w:pPr>
-        <w:pStyle w:val="ListParagraph"/>
-        <w:numPr>
-          <w:ilvl w:val="0"/>
-          <w:numId w:val="2"/>
-        </w:numPr>
-      </w:pPr>
-      <w:r>
-        <w:t>Conclusions and Future Work</w:t>
-      </w:r>
-    </w:p>
-    <w:p>
-      <w:pPr>
-        <w:pStyle w:val="ListParagraph"/>
-        <w:numPr>
-          <w:ilvl w:val="1"/>
-          <w:numId w:val="2"/>
-        </w:numPr>
-      </w:pPr>
-      <w:r>
-        <w:t>Summary of Key Findings</w:t>
-      </w:r>
-    </w:p>
-    <w:p>
-      <w:pPr>
-        <w:pStyle w:val="ListParagraph"/>
-        <w:numPr>
-          <w:ilvl w:val="2"/>
-          <w:numId w:val="2"/>
-        </w:numPr>
-      </w:pPr>
-      <w:r>
-        <w:t>Impact of competition and cooperation on user performance and engagement.</w:t>
-      </w:r>
-    </w:p>
-    <w:p>
-      <w:pPr>
-        <w:pStyle w:val="ListParagraph"/>
-        <w:numPr>
-          <w:ilvl w:val="2"/>
-          <w:numId w:val="2"/>
-        </w:numPr>
-      </w:pPr>
-      <w:r>
-        <w:t>Strengths and weaknesses of the developed system.</w:t>
-      </w:r>
-    </w:p>
-    <w:p>
-      <w:pPr>
-        <w:pStyle w:val="ListParagraph"/>
-        <w:numPr>
-          <w:ilvl w:val="1"/>
+        <w:t xml:space="preserve"> AI to better adapt to different skill levels.</w:t>
+      </w:r>
+    </w:p>
+    <w:p>
+      <w:pPr>
+        <w:pStyle w:val="ListParagraph"/>
+        <w:numPr>
+          <w:ilvl w:val="2"/>
+          <w:numId w:val="2"/>
+        </w:numPr>
+      </w:pPr>
+      <w:r>
+        <w:t>Expanding to multiplayer online modes.</w:t>
+      </w:r>
+    </w:p>
+    <w:p>
+      <w:pPr>
+        <w:pStyle w:val="ListParagraph"/>
+        <w:numPr>
+          <w:ilvl w:val="2"/>
+          <w:numId w:val="2"/>
+        </w:numPr>
+      </w:pPr>
+      <w:r>
+        <w:t>Longitudinal studies on fitness adherence using the developed platform.</w:t>
+      </w:r>
+    </w:p>
+    <w:p>
+      <w:pPr>
+        <w:pStyle w:val="ListParagraph"/>
+        <w:numPr>
+          <w:ilvl w:val="2"/>
           <w:numId w:val="2"/>
         </w:numPr>
       </w:pPr>
       <w:r>
         <w:lastRenderedPageBreak/>
-        <w:t>Contributions to the field</w:t>
-      </w:r>
-    </w:p>
-    <w:p>
-      <w:pPr>
-        <w:pStyle w:val="ListParagraph"/>
-        <w:numPr>
-          <w:ilvl w:val="2"/>
-          <w:numId w:val="2"/>
-        </w:numPr>
-      </w:pPr>
-      <w:r>
-        <w:t>Novelty of integrating social mechanics dynamically in VR exergames.</w:t>
-      </w:r>
-    </w:p>
-    <w:p>
-      <w:pPr>
-        <w:pStyle w:val="ListParagraph"/>
-        <w:numPr>
-          <w:ilvl w:val="2"/>
-          <w:numId w:val="2"/>
-        </w:numPr>
-      </w:pPr>
-      <w:r>
-        <w:t>Insights into VR exergaming for different personality and fitness types.</w:t>
-      </w:r>
-    </w:p>
-    <w:p>
-      <w:pPr>
-        <w:pStyle w:val="ListParagraph"/>
-        <w:numPr>
-          <w:ilvl w:val="1"/>
-          <w:numId w:val="2"/>
-        </w:numPr>
-      </w:pPr>
-      <w:r>
-        <w:t>Future Work</w:t>
-      </w:r>
-    </w:p>
-    <w:p>
-      <w:pPr>
-        <w:pStyle w:val="ListParagraph"/>
-        <w:numPr>
-          <w:ilvl w:val="2"/>
-          <w:numId w:val="2"/>
-        </w:numPr>
-      </w:pPr>
+        <w:t>Broader application in rehab and sports training.</w:t>
+      </w:r>
+    </w:p>
+    <w:p>
+      <w:r>
+        <w:t>References:</w:t>
+      </w:r>
+    </w:p>
+    <w:p>
+      <w:r>
+        <w:t xml:space="preserve">Farrow M, </w:t>
+      </w:r>
       <w:proofErr w:type="spellStart"/>
       <w:r>
-        <w:t>Improvign</w:t>
+        <w:t>Lutteroth</w:t>
       </w:r>
       <w:proofErr w:type="spellEnd"/>
       <w:r>
-        <w:t xml:space="preserve"> AI to better adapt to different skill levels.</w:t>
-      </w:r>
-    </w:p>
-    <w:p>
-      <w:pPr>
-        <w:pStyle w:val="ListParagraph"/>
-        <w:numPr>
-          <w:ilvl w:val="2"/>
-          <w:numId w:val="2"/>
-        </w:numPr>
-      </w:pPr>
-      <w:r>
-        <w:t>Expanding to multiplayer online modes.</w:t>
-      </w:r>
-    </w:p>
-    <w:p>
-      <w:pPr>
-        <w:pStyle w:val="ListParagraph"/>
-        <w:numPr>
-          <w:ilvl w:val="2"/>
-          <w:numId w:val="2"/>
-        </w:numPr>
-      </w:pPr>
-      <w:r>
-        <w:t>Longitudinal studies on fitness adherence using the developed platform.</w:t>
-      </w:r>
-    </w:p>
-    <w:p>
-      <w:pPr>
-        <w:pStyle w:val="ListParagraph"/>
-        <w:numPr>
-          <w:ilvl w:val="2"/>
-          <w:numId w:val="2"/>
-        </w:numPr>
-      </w:pPr>
-      <w:r>
-        <w:t>Broader application in rehab and sports training.</w:t>
-      </w:r>
-    </w:p>
-    <w:p/>
+        <w:t xml:space="preserve"> C, Rouse PC, Bilzon JLJ. Virtual-reality exergaming improves performance during high-intensity interval training. </w:t>
+      </w:r>
+      <w:proofErr w:type="spellStart"/>
+      <w:r>
+        <w:t>Eur</w:t>
+      </w:r>
+      <w:proofErr w:type="spellEnd"/>
+      <w:r>
+        <w:t xml:space="preserve"> J Sport Sci. 2019 Jul;19(6):719-727. </w:t>
+      </w:r>
+      <w:proofErr w:type="spellStart"/>
+      <w:r>
+        <w:t>doi</w:t>
+      </w:r>
+      <w:proofErr w:type="spellEnd"/>
+      <w:r>
+        <w:t xml:space="preserve">: 10.1080/17461391.2018.1542459. </w:t>
+      </w:r>
+      <w:proofErr w:type="spellStart"/>
+      <w:r>
+        <w:t>Epub</w:t>
+      </w:r>
+      <w:proofErr w:type="spellEnd"/>
+      <w:r>
+        <w:t xml:space="preserve"> 2018 Nov 7. PMID: 30403927.</w:t>
+      </w:r>
+    </w:p>
+    <w:p>
+      <w:r>
+        <w:t xml:space="preserve">Michael, A. and </w:t>
+      </w:r>
+      <w:proofErr w:type="spellStart"/>
+      <w:r>
+        <w:t>Lutteroth</w:t>
+      </w:r>
+      <w:proofErr w:type="spellEnd"/>
+      <w:r>
+        <w:t xml:space="preserve">, C. (2020) </w:t>
+      </w:r>
+      <w:r>
+        <w:rPr>
+          <w:i/>
+          <w:iCs/>
+        </w:rPr>
+        <w:t>Race yourselves: A longitudinal exploration of self-competition between past, present, and future performances in a VR exergame — the University of Bath’s Research Portal</w:t>
+      </w:r>
+      <w:r>
+        <w:t xml:space="preserve">, </w:t>
+      </w:r>
+      <w:r>
+        <w:rPr>
+          <w:i/>
+          <w:iCs/>
+        </w:rPr>
+        <w:t>Race Yourselves: A Longitudinal Exploration of Self-Competition Between Past, Present, and Future Performances in a VR Exergame</w:t>
+      </w:r>
+      <w:r>
+        <w:t xml:space="preserve">. Available at: https://researchportal.bath.ac.uk/en/publications/race-yourselves-a-longitudinal-exploration-of-self-competition-be (Accessed: 13 March 2025). </w:t>
+      </w:r>
+    </w:p>
+    <w:p>
+      <w:r>
+        <w:t xml:space="preserve">Marotta N, Calafiore D, Curci C, Lippi L, </w:t>
+      </w:r>
+      <w:proofErr w:type="spellStart"/>
+      <w:r>
+        <w:t>Ammendolia</w:t>
+      </w:r>
+      <w:proofErr w:type="spellEnd"/>
+      <w:r>
+        <w:t xml:space="preserve"> V, Ferraro F, Invernizzi M, de Sire A. Integrating virtual reality and exergaming in cognitive rehabilitation of patients with Parkinson disease: a systematic review of randomized controlled trials. </w:t>
+      </w:r>
+      <w:proofErr w:type="spellStart"/>
+      <w:r>
+        <w:t>Eur</w:t>
+      </w:r>
+      <w:proofErr w:type="spellEnd"/>
+      <w:r>
+        <w:t xml:space="preserve"> J Phys </w:t>
+      </w:r>
+      <w:proofErr w:type="spellStart"/>
+      <w:r>
+        <w:t>Rehabil</w:t>
+      </w:r>
+      <w:proofErr w:type="spellEnd"/>
+      <w:r>
+        <w:t xml:space="preserve"> Med. 2022 Dec;58(6):818-826. </w:t>
+      </w:r>
+      <w:proofErr w:type="spellStart"/>
+      <w:r>
+        <w:t>doi</w:t>
+      </w:r>
+      <w:proofErr w:type="spellEnd"/>
+      <w:r>
+        <w:t xml:space="preserve">: 10.23736/S1973-9087.22.07643-2. </w:t>
+      </w:r>
+      <w:proofErr w:type="spellStart"/>
+      <w:r>
+        <w:t>Epub</w:t>
+      </w:r>
+      <w:proofErr w:type="spellEnd"/>
+      <w:r>
+        <w:t xml:space="preserve"> 2022 Sep 28. PMID: 36169933; PMCID: PMC10081485.</w:t>
+      </w:r>
+      <w:r>
+        <w:t xml:space="preserve"> </w:t>
+      </w:r>
+      <w:hyperlink r:id="rId6" w:history="1">
+        <w:r>
+          <w:rPr>
+            <w:rStyle w:val="Hyperlink"/>
+          </w:rPr>
+          <w:t>https://pmc.ncbi.nlm.nih.gov/articles/PMC10081485/</w:t>
+        </w:r>
+      </w:hyperlink>
+      <w:r>
+        <w:t xml:space="preserve"> </w:t>
+      </w:r>
+    </w:p>
     <w:sectPr>
       <w:pgSz w:w="11906" w:h="16838"/>
       <w:pgMar w:top="1440" w:right="1440" w:bottom="1440" w:left="1440" w:header="708" w:footer="708" w:gutter="0"/>
@@ -940,6 +1328,95 @@
     </w:lvl>
   </w:abstractNum>
   <w:abstractNum w:abstractNumId="1" w15:restartNumberingAfterBreak="0">
+    <w:nsid w:val="51811B7A"/>
+    <w:multiLevelType w:val="hybridMultilevel"/>
+    <w:tmpl w:val="087CE150"/>
+    <w:lvl w:ilvl="0" w:tplc="08090019">
+      <w:start w:val="1"/>
+      <w:numFmt w:val="lowerLetter"/>
+      <w:lvlText w:val="%1."/>
+      <w:lvlJc w:val="left"/>
+      <w:pPr>
+        <w:ind w:left="720" w:hanging="360"/>
+      </w:pPr>
+      <w:rPr>
+        <w:rFonts w:hint="default"/>
+      </w:rPr>
+    </w:lvl>
+    <w:lvl w:ilvl="1" w:tplc="08090019" w:tentative="1">
+      <w:start w:val="1"/>
+      <w:numFmt w:val="lowerLetter"/>
+      <w:lvlText w:val="%2."/>
+      <w:lvlJc w:val="left"/>
+      <w:pPr>
+        <w:ind w:left="1440" w:hanging="360"/>
+      </w:pPr>
+    </w:lvl>
+    <w:lvl w:ilvl="2" w:tplc="0809001B" w:tentative="1">
+      <w:start w:val="1"/>
+      <w:numFmt w:val="lowerRoman"/>
+      <w:lvlText w:val="%3."/>
+      <w:lvlJc w:val="right"/>
+      <w:pPr>
+        <w:ind w:left="2160" w:hanging="180"/>
+      </w:pPr>
+    </w:lvl>
+    <w:lvl w:ilvl="3" w:tplc="0809000F" w:tentative="1">
+      <w:start w:val="1"/>
+      <w:numFmt w:val="decimal"/>
+      <w:lvlText w:val="%4."/>
+      <w:lvlJc w:val="left"/>
+      <w:pPr>
+        <w:ind w:left="2880" w:hanging="360"/>
+      </w:pPr>
+    </w:lvl>
+    <w:lvl w:ilvl="4" w:tplc="08090019" w:tentative="1">
+      <w:start w:val="1"/>
+      <w:numFmt w:val="lowerLetter"/>
+      <w:lvlText w:val="%5."/>
+      <w:lvlJc w:val="left"/>
+      <w:pPr>
+        <w:ind w:left="3600" w:hanging="360"/>
+      </w:pPr>
+    </w:lvl>
+    <w:lvl w:ilvl="5" w:tplc="0809001B" w:tentative="1">
+      <w:start w:val="1"/>
+      <w:numFmt w:val="lowerRoman"/>
+      <w:lvlText w:val="%6."/>
+      <w:lvlJc w:val="right"/>
+      <w:pPr>
+        <w:ind w:left="4320" w:hanging="180"/>
+      </w:pPr>
+    </w:lvl>
+    <w:lvl w:ilvl="6" w:tplc="0809000F" w:tentative="1">
+      <w:start w:val="1"/>
+      <w:numFmt w:val="decimal"/>
+      <w:lvlText w:val="%7."/>
+      <w:lvlJc w:val="left"/>
+      <w:pPr>
+        <w:ind w:left="5040" w:hanging="360"/>
+      </w:pPr>
+    </w:lvl>
+    <w:lvl w:ilvl="7" w:tplc="08090019" w:tentative="1">
+      <w:start w:val="1"/>
+      <w:numFmt w:val="lowerLetter"/>
+      <w:lvlText w:val="%8."/>
+      <w:lvlJc w:val="left"/>
+      <w:pPr>
+        <w:ind w:left="5760" w:hanging="360"/>
+      </w:pPr>
+    </w:lvl>
+    <w:lvl w:ilvl="8" w:tplc="0809001B" w:tentative="1">
+      <w:start w:val="1"/>
+      <w:numFmt w:val="lowerRoman"/>
+      <w:lvlText w:val="%9."/>
+      <w:lvlJc w:val="right"/>
+      <w:pPr>
+        <w:ind w:left="6480" w:hanging="180"/>
+      </w:pPr>
+    </w:lvl>
+  </w:abstractNum>
+  <w:abstractNum w:abstractNumId="2" w15:restartNumberingAfterBreak="0">
     <w:nsid w:val="75434B19"/>
     <w:multiLevelType w:val="hybridMultilevel"/>
     <w:tmpl w:val="D3E6CB76"/>
@@ -1029,10 +1506,13 @@
     </w:lvl>
   </w:abstractNum>
   <w:num w:numId="1" w16cid:durableId="159733540">
-    <w:abstractNumId w:val="1"/>
+    <w:abstractNumId w:val="2"/>
   </w:num>
   <w:num w:numId="2" w16cid:durableId="2095978941">
     <w:abstractNumId w:val="0"/>
+  </w:num>
+  <w:num w:numId="3" w16cid:durableId="11029832">
+    <w:abstractNumId w:val="1"/>
   </w:num>
 </w:numbering>
 </file>
@@ -1953,6 +2433,41 @@
       <w:spacing w:val="5"/>
     </w:rPr>
   </w:style>
+  <w:style w:type="character" w:styleId="Hyperlink">
+    <w:name w:val="Hyperlink"/>
+    <w:basedOn w:val="DefaultParagraphFont"/>
+    <w:uiPriority w:val="99"/>
+    <w:unhideWhenUsed/>
+    <w:rsid w:val="00B146BB"/>
+    <w:rPr>
+      <w:color w:val="467886" w:themeColor="hyperlink"/>
+      <w:u w:val="single"/>
+    </w:rPr>
+  </w:style>
+  <w:style w:type="character" w:styleId="UnresolvedMention">
+    <w:name w:val="Unresolved Mention"/>
+    <w:basedOn w:val="DefaultParagraphFont"/>
+    <w:uiPriority w:val="99"/>
+    <w:semiHidden/>
+    <w:unhideWhenUsed/>
+    <w:rsid w:val="00B146BB"/>
+    <w:rPr>
+      <w:color w:val="605E5C"/>
+      <w:shd w:val="clear" w:color="auto" w:fill="E1DFDD"/>
+    </w:rPr>
+  </w:style>
+  <w:style w:type="character" w:styleId="FollowedHyperlink">
+    <w:name w:val="FollowedHyperlink"/>
+    <w:basedOn w:val="DefaultParagraphFont"/>
+    <w:uiPriority w:val="99"/>
+    <w:semiHidden/>
+    <w:unhideWhenUsed/>
+    <w:rsid w:val="004D0D77"/>
+    <w:rPr>
+      <w:color w:val="96607D" w:themeColor="followedHyperlink"/>
+      <w:u w:val="single"/>
+    </w:rPr>
+  </w:style>
 </w:styles>
 </file>
 

</xml_diff>

<commit_message>
Changes to final report
</commit_message>
<xml_diff>
--- a/Final Report.docx
+++ b/Final Report.docx
@@ -576,7 +576,7 @@
           <w:sz w:val="22"/>
           <w:szCs w:val="22"/>
         </w:rPr>
-        <w:t xml:space="preserve"> (as in initial plan)</w:t>
+        <w:t xml:space="preserve"> </w:t>
       </w:r>
     </w:p>
     <w:p>
@@ -923,14 +923,6 @@
           <w:szCs w:val="22"/>
         </w:rPr>
         <w:t>Project Scope and Limitations</w:t>
-      </w:r>
-      <w:r>
-        <w:rPr>
-          <w:rFonts w:cs="Calibri"/>
-          <w:sz w:val="22"/>
-          <w:szCs w:val="22"/>
-        </w:rPr>
-        <w:t xml:space="preserve"> (VR cycling, social dynamics, engagement/performance assessment)</w:t>
       </w:r>
     </w:p>
     <w:p>
@@ -2185,16 +2177,7 @@
             <w:sz w:val="22"/>
             <w:szCs w:val="22"/>
           </w:rPr>
-          <w:t>[</w:t>
-        </w:r>
-        <w:r>
-          <w:rPr>
-            <w:rStyle w:val="Hyperlink"/>
-            <w:rFonts w:cs="Calibri"/>
-            <w:sz w:val="22"/>
-            <w:szCs w:val="22"/>
-          </w:rPr>
-          <w:t>]</w:t>
+          <w:t>[]</w:t>
         </w:r>
       </w:hyperlink>
       <w:r>
@@ -2806,6 +2789,228 @@
           <w:szCs w:val="22"/>
         </w:rPr>
       </w:pPr>
+      <w:r>
+        <w:rPr>
+          <w:rFonts w:cs="Calibri"/>
+          <w:color w:val="FF0000"/>
+          <w:sz w:val="22"/>
+          <w:szCs w:val="22"/>
+        </w:rPr>
+        <w:t>(Shaw et al 2016)</w:t>
+      </w:r>
+      <w:r>
+        <w:rPr>
+          <w:rFonts w:cs="Calibri"/>
+          <w:sz w:val="22"/>
+          <w:szCs w:val="22"/>
+        </w:rPr>
+        <w:t xml:space="preserve"> found that participants in VR cycling scenarios with cooperative and competitive social dynamics expended significantly more effort and reported higher engagement compared to those cycling alone or with a ghost. </w:t>
+      </w:r>
+      <w:r>
+        <w:rPr>
+          <w:rFonts w:cs="Calibri"/>
+          <w:sz w:val="22"/>
+          <w:szCs w:val="22"/>
+        </w:rPr>
+        <w:t>This supports the idea that social presence and dynamics can act as standalone motivators in exergames, aligning with this project’s focus on AI-driven social mechanics over traditional gamified elements.</w:t>
+      </w:r>
+    </w:p>
+    <w:p>
+      <w:pPr>
+        <w:spacing w:after="0" w:line="276" w:lineRule="auto"/>
+        <w:rPr>
+          <w:rFonts w:cs="Calibri"/>
+          <w:sz w:val="22"/>
+          <w:szCs w:val="22"/>
+        </w:rPr>
+      </w:pPr>
+    </w:p>
+    <w:p>
+      <w:pPr>
+        <w:spacing w:after="0" w:line="276" w:lineRule="auto"/>
+        <w:rPr>
+          <w:rFonts w:cs="Calibri"/>
+          <w:sz w:val="22"/>
+          <w:szCs w:val="22"/>
+        </w:rPr>
+      </w:pPr>
+      <w:r>
+        <w:rPr>
+          <w:rFonts w:cs="Calibri"/>
+          <w:sz w:val="22"/>
+          <w:szCs w:val="22"/>
+        </w:rPr>
+        <w:t xml:space="preserve">Similarly, </w:t>
+      </w:r>
+      <w:r>
+        <w:rPr>
+          <w:rFonts w:cs="Calibri"/>
+          <w:color w:val="FF0000"/>
+          <w:sz w:val="22"/>
+          <w:szCs w:val="22"/>
+        </w:rPr>
+        <w:t>(Michael et al 2020</w:t>
+      </w:r>
+      <w:r>
+        <w:rPr>
+          <w:rFonts w:cs="Calibri"/>
+          <w:sz w:val="22"/>
+          <w:szCs w:val="22"/>
+        </w:rPr>
+        <w:t xml:space="preserve">) demonstrated that a </w:t>
+      </w:r>
+      <w:proofErr w:type="spellStart"/>
+      <w:r>
+        <w:rPr>
+          <w:rFonts w:cs="Calibri"/>
+          <w:sz w:val="22"/>
+          <w:szCs w:val="22"/>
+        </w:rPr>
+        <w:t>multighost</w:t>
+      </w:r>
+      <w:proofErr w:type="spellEnd"/>
+      <w:r>
+        <w:rPr>
+          <w:rFonts w:cs="Calibri"/>
+          <w:sz w:val="22"/>
+          <w:szCs w:val="22"/>
+        </w:rPr>
+        <w:t xml:space="preserve"> competition model in VR cycling led to a 16% increase in performance over four weeks. This reinforces the idea that gamification is not required to drive improvement, rather, engaging challenges that evolve with the user, such as AI-based competition, can yield meaningful fitness outcomes. </w:t>
+      </w:r>
+    </w:p>
+    <w:p>
+      <w:pPr>
+        <w:spacing w:after="0" w:line="276" w:lineRule="auto"/>
+        <w:rPr>
+          <w:rFonts w:cs="Calibri"/>
+          <w:sz w:val="22"/>
+          <w:szCs w:val="22"/>
+        </w:rPr>
+      </w:pPr>
+    </w:p>
+    <w:p>
+      <w:pPr>
+        <w:spacing w:after="0" w:line="276" w:lineRule="auto"/>
+        <w:rPr>
+          <w:rFonts w:cs="Calibri"/>
+          <w:sz w:val="22"/>
+          <w:szCs w:val="22"/>
+        </w:rPr>
+      </w:pPr>
+      <w:r>
+        <w:rPr>
+          <w:rFonts w:cs="Calibri"/>
+          <w:sz w:val="22"/>
+          <w:szCs w:val="22"/>
+        </w:rPr>
+        <w:t xml:space="preserve">According to </w:t>
+      </w:r>
+      <w:r>
+        <w:rPr>
+          <w:rFonts w:cs="Calibri"/>
+          <w:color w:val="FF0000"/>
+          <w:sz w:val="22"/>
+          <w:szCs w:val="22"/>
+        </w:rPr>
+        <w:t>Deci and Ryans Self-Determination Theory</w:t>
+      </w:r>
+      <w:r>
+        <w:rPr>
+          <w:rFonts w:cs="Calibri"/>
+          <w:sz w:val="22"/>
+          <w:szCs w:val="22"/>
+        </w:rPr>
+        <w:t xml:space="preserve">, intrinsic motivation arises when </w:t>
+      </w:r>
+      <w:r>
+        <w:rPr>
+          <w:rFonts w:cs="Calibri"/>
+          <w:sz w:val="22"/>
+          <w:szCs w:val="22"/>
+        </w:rPr>
+        <w:t>individuals</w:t>
+      </w:r>
+      <w:r>
+        <w:rPr>
+          <w:rFonts w:cs="Calibri"/>
+          <w:sz w:val="22"/>
+          <w:szCs w:val="22"/>
+        </w:rPr>
+        <w:t xml:space="preserve"> experience competence, autonomy, and relatedness. The heads-up display (HUD) used in this system directly supports competence through real-time feedback, while the </w:t>
+      </w:r>
+      <w:r>
+        <w:rPr>
+          <w:rFonts w:cs="Calibri"/>
+          <w:sz w:val="22"/>
+          <w:szCs w:val="22"/>
+        </w:rPr>
+        <w:lastRenderedPageBreak/>
+        <w:t xml:space="preserve">cooperative and competitive modes encourage relatedness, creating a socially meaningful workout experience even with the absence of traditional gamified features. </w:t>
+      </w:r>
+    </w:p>
+    <w:p>
+      <w:pPr>
+        <w:spacing w:after="0" w:line="276" w:lineRule="auto"/>
+        <w:rPr>
+          <w:rFonts w:cs="Calibri"/>
+          <w:sz w:val="22"/>
+          <w:szCs w:val="22"/>
+        </w:rPr>
+      </w:pPr>
+    </w:p>
+    <w:p>
+      <w:pPr>
+        <w:spacing w:after="0" w:line="276" w:lineRule="auto"/>
+        <w:rPr>
+          <w:rFonts w:cs="Calibri"/>
+          <w:sz w:val="22"/>
+          <w:szCs w:val="22"/>
+        </w:rPr>
+      </w:pPr>
+      <w:r>
+        <w:rPr>
+          <w:rFonts w:cs="Calibri"/>
+          <w:sz w:val="22"/>
+          <w:szCs w:val="22"/>
+        </w:rPr>
+        <w:t xml:space="preserve">While </w:t>
+      </w:r>
+      <w:proofErr w:type="spellStart"/>
+      <w:r>
+        <w:rPr>
+          <w:rFonts w:cs="Calibri"/>
+          <w:color w:val="FF0000"/>
+          <w:sz w:val="22"/>
+          <w:szCs w:val="22"/>
+        </w:rPr>
+        <w:t>Cugelman</w:t>
+      </w:r>
+      <w:proofErr w:type="spellEnd"/>
+      <w:r>
+        <w:rPr>
+          <w:rFonts w:cs="Calibri"/>
+          <w:color w:val="FF0000"/>
+          <w:sz w:val="22"/>
+          <w:szCs w:val="22"/>
+        </w:rPr>
+        <w:t xml:space="preserve"> (2013)</w:t>
+      </w:r>
+      <w:r>
+        <w:rPr>
+          <w:rFonts w:cs="Calibri"/>
+          <w:sz w:val="22"/>
+          <w:szCs w:val="22"/>
+        </w:rPr>
+        <w:t xml:space="preserve"> outlines </w:t>
+      </w:r>
+      <w:r>
+        <w:rPr>
+          <w:rFonts w:cs="Calibri"/>
+          <w:sz w:val="22"/>
+          <w:szCs w:val="22"/>
+        </w:rPr>
+        <w:t>game mechanics such as rewards and progress tracking as key tools in behaviour change, the paper also emphasises the importance of timely feedback and goal-related metrics, both of which are central to the program developed in this project. By presenting performance stats through a heads-up display, the user remains engaged through self-monitoring, fulfilling many of the same behavioural incentives as gamification.</w:t>
+      </w:r>
     </w:p>
     <w:p>
       <w:pPr>
@@ -2859,6 +3064,224 @@
           <w:szCs w:val="22"/>
         </w:rPr>
       </w:pPr>
+      <w:r>
+        <w:rPr>
+          <w:rFonts w:cs="Calibri"/>
+          <w:sz w:val="22"/>
+          <w:szCs w:val="22"/>
+        </w:rPr>
+        <w:t xml:space="preserve">Most VR fitness apps offer a static challenge and rarely offer intelligent adaptability for different fitness levels. </w:t>
+      </w:r>
+      <w:r>
+        <w:rPr>
+          <w:rFonts w:cs="Calibri"/>
+          <w:sz w:val="22"/>
+          <w:szCs w:val="22"/>
+        </w:rPr>
+        <w:t xml:space="preserve"> </w:t>
+      </w:r>
+      <w:r>
+        <w:rPr>
+          <w:rFonts w:cs="Calibri"/>
+          <w:sz w:val="22"/>
+          <w:szCs w:val="22"/>
+        </w:rPr>
+        <w:t xml:space="preserve">This project addresses this gap by using interactive feedforward to proactively adjust AI behaviour based on historical user data which tailors the workout challenge to push the user further than they did before. </w:t>
+      </w:r>
+    </w:p>
+    <w:p>
+      <w:pPr>
+        <w:spacing w:after="0" w:line="276" w:lineRule="auto"/>
+        <w:rPr>
+          <w:rFonts w:cs="Calibri"/>
+          <w:sz w:val="22"/>
+          <w:szCs w:val="22"/>
+        </w:rPr>
+      </w:pPr>
+    </w:p>
+    <w:p>
+      <w:pPr>
+        <w:spacing w:after="0" w:line="276" w:lineRule="auto"/>
+        <w:rPr>
+          <w:rFonts w:cs="Calibri"/>
+          <w:sz w:val="22"/>
+          <w:szCs w:val="22"/>
+        </w:rPr>
+      </w:pPr>
+      <w:r>
+        <w:rPr>
+          <w:rFonts w:cs="Calibri"/>
+          <w:sz w:val="22"/>
+          <w:szCs w:val="22"/>
+        </w:rPr>
+        <w:t xml:space="preserve">Previous studies </w:t>
+      </w:r>
+      <w:r>
+        <w:rPr>
+          <w:rFonts w:cs="Calibri"/>
+          <w:color w:val="FF0000"/>
+          <w:sz w:val="22"/>
+          <w:szCs w:val="22"/>
+        </w:rPr>
+        <w:t xml:space="preserve">(Shaw et al 2016) </w:t>
+      </w:r>
+      <w:r>
+        <w:rPr>
+          <w:rFonts w:cs="Calibri"/>
+          <w:sz w:val="22"/>
+          <w:szCs w:val="22"/>
+        </w:rPr>
+        <w:t xml:space="preserve">had users speed directly correlate to how fast the </w:t>
+      </w:r>
+      <w:proofErr w:type="gramStart"/>
+      <w:r>
+        <w:rPr>
+          <w:rFonts w:cs="Calibri"/>
+          <w:sz w:val="22"/>
+          <w:szCs w:val="22"/>
+        </w:rPr>
+        <w:t>users</w:t>
+      </w:r>
+      <w:proofErr w:type="gramEnd"/>
+      <w:r>
+        <w:rPr>
+          <w:rFonts w:cs="Calibri"/>
+          <w:sz w:val="22"/>
+          <w:szCs w:val="22"/>
+        </w:rPr>
+        <w:t xml:space="preserve"> cadence was, i.e. the faster you pedal the faster you go. This </w:t>
+      </w:r>
+      <w:proofErr w:type="gramStart"/>
+      <w:r>
+        <w:rPr>
+          <w:rFonts w:cs="Calibri"/>
+          <w:sz w:val="22"/>
+          <w:szCs w:val="22"/>
+        </w:rPr>
+        <w:t>opens up</w:t>
+      </w:r>
+      <w:proofErr w:type="gramEnd"/>
+      <w:r>
+        <w:rPr>
+          <w:rFonts w:cs="Calibri"/>
+          <w:sz w:val="22"/>
+          <w:szCs w:val="22"/>
+        </w:rPr>
+        <w:t xml:space="preserve"> research to flaws such as inconsistent pacing strategies across sessions where less physically active participants better learn how to prolong their workout </w:t>
+      </w:r>
+      <w:r>
+        <w:rPr>
+          <w:rFonts w:cs="Calibri"/>
+          <w:sz w:val="22"/>
+          <w:szCs w:val="22"/>
+        </w:rPr>
+        <w:t xml:space="preserve">simply by having more practice on the system. This project resolves this problem with the use of ERG mode, a feature on many smart bike trainers that automatically adjusts the resistance to help you maintain a specific power output rather than having to manually control resistance. Using ERG mode, this project was able to eliminate the variable of pacing through ensuring that the users were outputting the wattage the exercise bike was asking of them. Additionally, having participants produce a set wattage each second of the workout allows AI to better tailor the challenge to the participant as the data is smoother and more reliable when it comes to mimicking previous performances. </w:t>
+      </w:r>
+    </w:p>
+    <w:p>
+      <w:pPr>
+        <w:spacing w:after="0" w:line="276" w:lineRule="auto"/>
+        <w:rPr>
+          <w:rFonts w:cs="Calibri"/>
+          <w:sz w:val="22"/>
+          <w:szCs w:val="22"/>
+        </w:rPr>
+      </w:pPr>
+    </w:p>
+    <w:p>
+      <w:pPr>
+        <w:spacing w:after="0" w:line="276" w:lineRule="auto"/>
+        <w:rPr>
+          <w:rFonts w:cs="Calibri"/>
+          <w:sz w:val="22"/>
+          <w:szCs w:val="22"/>
+        </w:rPr>
+      </w:pPr>
+      <w:r>
+        <w:rPr>
+          <w:rFonts w:cs="Calibri"/>
+          <w:sz w:val="22"/>
+          <w:szCs w:val="22"/>
+        </w:rPr>
+        <w:t xml:space="preserve">Past research has shown </w:t>
+      </w:r>
+      <w:r>
+        <w:rPr>
+          <w:rFonts w:cs="Calibri"/>
+          <w:sz w:val="22"/>
+          <w:szCs w:val="22"/>
+        </w:rPr>
+        <w:t>competition,</w:t>
+      </w:r>
+      <w:r>
+        <w:rPr>
+          <w:rFonts w:cs="Calibri"/>
+          <w:sz w:val="22"/>
+          <w:szCs w:val="22"/>
+        </w:rPr>
+        <w:t xml:space="preserve"> and cooperation can boost motivation </w:t>
+      </w:r>
+      <w:r>
+        <w:rPr>
+          <w:rFonts w:cs="Calibri"/>
+          <w:color w:val="FF0000"/>
+          <w:sz w:val="22"/>
+          <w:szCs w:val="22"/>
+        </w:rPr>
+        <w:t>(shaw et al 2016, Michael et al 2020</w:t>
+      </w:r>
+      <w:r>
+        <w:rPr>
+          <w:rFonts w:cs="Calibri"/>
+          <w:sz w:val="22"/>
+          <w:szCs w:val="22"/>
+        </w:rPr>
+        <w:t xml:space="preserve">), but few systems intentionally compare these dynamics in a controlled way. Additionally, there is little analysis of user preference or personality types influencing effectiveness. This solution directly compares scenarios (1) baseline, (2) cooperative, (3) competitive, and collects both quantitative performance feedback, and qualitative form feedback after all three. From this, this project aims to test which type of social interaction is most </w:t>
+      </w:r>
+      <w:r>
+        <w:rPr>
+          <w:rFonts w:cs="Calibri"/>
+          <w:sz w:val="22"/>
+          <w:szCs w:val="22"/>
+        </w:rPr>
+        <w:t>effective and</w:t>
+      </w:r>
+      <w:r>
+        <w:rPr>
+          <w:rFonts w:cs="Calibri"/>
+          <w:sz w:val="22"/>
+          <w:szCs w:val="22"/>
+        </w:rPr>
+        <w:t xml:space="preserve"> investigate if different personalities thrive in different modes. </w:t>
+      </w:r>
+    </w:p>
+    <w:p>
+      <w:pPr>
+        <w:spacing w:after="0" w:line="276" w:lineRule="auto"/>
+        <w:rPr>
+          <w:rFonts w:cs="Calibri"/>
+          <w:sz w:val="22"/>
+          <w:szCs w:val="22"/>
+        </w:rPr>
+      </w:pPr>
+    </w:p>
+    <w:p>
+      <w:pPr>
+        <w:spacing w:after="0" w:line="276" w:lineRule="auto"/>
+        <w:rPr>
+          <w:rFonts w:cs="Calibri"/>
+          <w:sz w:val="22"/>
+          <w:szCs w:val="22"/>
+        </w:rPr>
+      </w:pPr>
+      <w:r>
+        <w:rPr>
+          <w:rFonts w:cs="Calibri"/>
+          <w:sz w:val="22"/>
+          <w:szCs w:val="22"/>
+        </w:rPr>
+        <w:t xml:space="preserve">Many fitness games assume a general audience and don’t scale well from complete beginners to high performance athletes. Additionally, particularly in the commercial industry, exergames often lack inclusive design for different motivational triggers or ability levels. This project combats that using the baseline condition to calibrate difficulty, as well as emphasises accessibility in UI and game pacing. </w:t>
+      </w:r>
     </w:p>
     <w:p>
       <w:pPr>
@@ -2895,6 +3318,121 @@
     </w:p>
     <w:p>
       <w:pPr>
+        <w:spacing w:after="0" w:line="276" w:lineRule="auto"/>
+        <w:rPr>
+          <w:rFonts w:cs="Calibri"/>
+          <w:sz w:val="22"/>
+          <w:szCs w:val="22"/>
+        </w:rPr>
+      </w:pPr>
+    </w:p>
+    <w:p>
+      <w:pPr>
+        <w:spacing w:after="0" w:line="276" w:lineRule="auto"/>
+        <w:rPr>
+          <w:rFonts w:cs="Calibri"/>
+          <w:sz w:val="22"/>
+          <w:szCs w:val="22"/>
+        </w:rPr>
+      </w:pPr>
+      <w:r>
+        <w:rPr>
+          <w:rFonts w:cs="Calibri"/>
+          <w:sz w:val="22"/>
+          <w:szCs w:val="22"/>
+        </w:rPr>
+        <w:lastRenderedPageBreak/>
+        <w:t>The literature highlights several opportunities for further innovation within the VR exergaming space. While prior research has shown that social dynamics such as competition and cooperation enhance motivation, few systems have directly compared these interaction styles in a controlled environment, nor accounted for how personality traits influence their effectiveness. Furthermore, many existing exergames fail to dynamically adapt to varying fitness levels, resulting in static challenges that may demotivate users over time or fail to meet their needs.</w:t>
+      </w:r>
+    </w:p>
+    <w:p>
+      <w:pPr>
+        <w:spacing w:after="0" w:line="276" w:lineRule="auto"/>
+        <w:rPr>
+          <w:rFonts w:cs="Calibri"/>
+          <w:sz w:val="22"/>
+          <w:szCs w:val="22"/>
+        </w:rPr>
+      </w:pPr>
+    </w:p>
+    <w:p>
+      <w:pPr>
+        <w:spacing w:after="0" w:line="276" w:lineRule="auto"/>
+        <w:rPr>
+          <w:rFonts w:cs="Calibri"/>
+          <w:sz w:val="22"/>
+          <w:szCs w:val="22"/>
+        </w:rPr>
+      </w:pPr>
+      <w:r>
+        <w:rPr>
+          <w:rFonts w:cs="Calibri"/>
+          <w:sz w:val="22"/>
+          <w:szCs w:val="22"/>
+        </w:rPr>
+        <w:t xml:space="preserve">This project addresses these gaps by integrating adaptive AI via interactive feedforward, implementing ERG mode to control pacing consistency, and calibrating challenge levels using initial baseline testing. By focusing on inclusive, data-driven design and </w:t>
+      </w:r>
+      <w:r>
+        <w:rPr>
+          <w:rFonts w:cs="Calibri"/>
+          <w:sz w:val="22"/>
+          <w:szCs w:val="22"/>
+        </w:rPr>
+        <w:t>comparing</w:t>
+      </w:r>
+      <w:r>
+        <w:rPr>
+          <w:rFonts w:cs="Calibri"/>
+          <w:sz w:val="22"/>
+          <w:szCs w:val="22"/>
+        </w:rPr>
+        <w:t xml:space="preserve"> distinct social interaction </w:t>
+      </w:r>
+      <w:r>
+        <w:rPr>
+          <w:rFonts w:cs="Calibri"/>
+          <w:sz w:val="22"/>
+          <w:szCs w:val="22"/>
+        </w:rPr>
+        <w:t>modes</w:t>
+      </w:r>
+      <w:r>
+        <w:rPr>
+          <w:rFonts w:cs="Calibri"/>
+          <w:sz w:val="22"/>
+          <w:szCs w:val="22"/>
+        </w:rPr>
+        <w:t xml:space="preserve">, the system seeks to provide more meaningful engagement, better performance outcomes, and deeper </w:t>
+      </w:r>
+      <w:r>
+        <w:rPr>
+          <w:rFonts w:cs="Calibri"/>
+          <w:sz w:val="22"/>
+          <w:szCs w:val="22"/>
+        </w:rPr>
+        <w:t>insight</w:t>
+      </w:r>
+      <w:r>
+        <w:rPr>
+          <w:rFonts w:cs="Calibri"/>
+          <w:sz w:val="22"/>
+          <w:szCs w:val="22"/>
+        </w:rPr>
+        <w:t xml:space="preserve"> into how different users respond to varied exergaming experiences. </w:t>
+      </w:r>
+    </w:p>
+    <w:p>
+      <w:pPr>
+        <w:spacing w:after="0" w:line="276" w:lineRule="auto"/>
+        <w:rPr>
+          <w:rFonts w:cs="Calibri"/>
+          <w:sz w:val="22"/>
+          <w:szCs w:val="22"/>
+        </w:rPr>
+      </w:pPr>
+    </w:p>
+    <w:p>
+      <w:pPr>
         <w:pStyle w:val="ListParagraph"/>
         <w:numPr>
           <w:ilvl w:val="0"/>
@@ -3074,7 +3612,6 @@
           <w:sz w:val="22"/>
           <w:szCs w:val="22"/>
         </w:rPr>
-        <w:lastRenderedPageBreak/>
         <w:t>Development environment (Unity, VR hardware, exercise bike integration).</w:t>
       </w:r>
     </w:p>
@@ -3530,6 +4067,7 @@
           <w:sz w:val="22"/>
           <w:szCs w:val="22"/>
         </w:rPr>
+        <w:lastRenderedPageBreak/>
         <w:t>Interpretation of results regarding performance under cooperative/competitive dynamics.</w:t>
       </w:r>
     </w:p>
@@ -3967,7 +4505,6 @@
           <w:sz w:val="22"/>
           <w:szCs w:val="22"/>
         </w:rPr>
-        <w:lastRenderedPageBreak/>
         <w:t>Improving</w:t>
       </w:r>
       <w:r>

</xml_diff>